<commit_message>
Main Web 23 Sep v1
</commit_message>
<xml_diff>
--- a/Atchison70ACTIVE/temp/Atchison70ACTIVE-Monthly-2025-08-31-Body.docx
+++ b/Atchison70ACTIVE/temp/Atchison70ACTIVE-Monthly-2025-08-31-Body.docx
@@ -1432,7 +1432,7 @@
       <w:r>
         <w:drawing>
           <wp:inline xmlns:a="http://schemas.openxmlformats.org/drawingml/2006/main" xmlns:pic="http://schemas.openxmlformats.org/drawingml/2006/picture">
-            <wp:extent cx="3240000" cy="2700000"/>
+            <wp:extent cx="3240000" cy="2322000"/>
             <wp:docPr id="4" name="Picture 4"/>
             <wp:cNvGraphicFramePr>
               <a:graphicFrameLocks noChangeAspect="1"/>
@@ -1453,7 +1453,7 @@
                   <pic:spPr>
                     <a:xfrm>
                       <a:off x="0" y="0"/>
-                      <a:ext cx="3240000" cy="2700000"/>
+                      <a:ext cx="3240000" cy="2322000"/>
                     </a:xfrm>
                     <a:prstGeom prst="rect"/>
                   </pic:spPr>
@@ -1652,7 +1652,7 @@
           </w:tcPr>
           <w:p>
             <w:r>
-              <w:t>Merlon Conentated AusEq</w:t>
+              <w:t>Merlon Concentrated AusEq</w:t>
             </w:r>
           </w:p>
         </w:tc>

</xml_diff>